<commit_message>
Ajout du compte rendu en Markdown et des captures d écran
Co-Authored-By: Claude Opus 5.5 <noreply@anthropic.com>
</commit_message>
<xml_diff>
--- a/Joseph_Keita_TP_Jour3.docx
+++ b/Joseph_Keita_TP_Jour3.docx
@@ -2,6 +2,44 @@
 <file path=word/document.xml><?xml version="1.0" encoding="utf-8"?>
 <w:document xmlns:wpc="http://schemas.microsoft.com/office/word/2010/wordprocessingCanvas" xmlns:cx="http://schemas.microsoft.com/office/drawing/2014/chartex" xmlns:cx1="http://schemas.microsoft.com/office/drawing/2015/9/8/chartex" xmlns:cx2="http://schemas.microsoft.com/office/drawing/2015/10/21/chartex" xmlns:cx3="http://schemas.microsoft.com/office/drawing/2016/5/9/chartex" xmlns:cx4="http://schemas.microsoft.com/office/drawing/2016/5/10/chartex" xmlns:cx5="http://schemas.microsoft.com/office/drawing/2016/5/11/chartex" xmlns:cx6="http://schemas.microsoft.com/office/drawing/2016/5/12/chartex" xmlns:cx7="http://schemas.microsoft.com/office/drawing/2016/5/13/chartex" xmlns:cx8="http://schemas.microsoft.com/office/drawing/2016/5/14/chartex" xmlns:mc="http://schemas.openxmlformats.org/markup-compatibility/2006" xmlns:aink="http://schemas.microsoft.com/office/drawing/2016/ink" xmlns:am3d="http://schemas.microsoft.com/office/drawing/2017/model3d" xmlns:o="urn:schemas-microsoft-com:office:office" xmlns:oel="http://schemas.microsoft.com/office/2019/extlst" xmlns:r="http://schemas.openxmlformats.org/officeDocument/2006/relationships" xmlns:m="http://schemas.openxmlformats.org/officeDocument/2006/math" xmlns:v="urn:schemas-microsoft-com:vml" xmlns:wp14="http://schemas.microsoft.com/office/word/2010/wordprocessingDrawing" xmlns:wp="http://schemas.openxmlformats.org/drawingml/2006/wordprocessingDrawing" xmlns:w10="urn:schemas-microsoft-com:office:word" xmlns:w="http://schemas.openxmlformats.org/wordprocessingml/2006/main" xmlns:w14="http://schemas.microsoft.com/office/word/2010/wordml" xmlns:w15="http://schemas.microsoft.com/office/word/2012/wordml" xmlns:w16cex="http://schemas.microsoft.com/office/word/2018/wordml/cex" xmlns:w16cid="http://schemas.microsoft.com/office/word/2016/wordml/cid" xmlns:w16="http://schemas.microsoft.com/office/word/2018/wordml" xmlns:w16sdtdh="http://schemas.microsoft.com/office/word/2020/wordml/sdtdatahash" xmlns:w16se="http://schemas.microsoft.com/office/word/2015/wordml/symex" xmlns:wpg="http://schemas.microsoft.com/office/word/2010/wordprocessingGroup" xmlns:wpi="http://schemas.microsoft.com/office/word/2010/wordprocessingInk" xmlns:wne="http://schemas.microsoft.com/office/word/2006/wordml" xmlns:wps="http://schemas.microsoft.com/office/word/2010/wordprocessingShape" mc:Ignorable="w14 w15 w16se w16cid w16 w16cex w16sdtdh wp14">
   <w:body>
+    <w:p>
+      <w:r>
+        <w:t>Joseph KEITA</w:t>
+      </w:r>
+    </w:p>
+    <w:p>
+      <w:pPr>
+        <w:pStyle w:val="Titre2"/>
+        <w:jc w:val="center"/>
+      </w:pPr>
+      <w:r>
+        <w:t>TP -Données Distribuée Cassandra avec réplication</w:t>
+      </w:r>
+    </w:p>
+    <w:p>
+      <w:pPr>
+        <w:jc w:val="center"/>
+        <w:rPr>
+          <w:i/>
+          <w:iCs/>
+        </w:rPr>
+      </w:pPr>
+      <w:r>
+        <w:rPr>
+          <w:i/>
+          <w:iCs/>
+        </w:rPr>
+        <w:t>Cassandra à 3 nœuds : RF = 3, cohérence et panne d'un nœud</w:t>
+      </w:r>
+    </w:p>
+    <w:p>
+      <w:pPr>
+        <w:rPr>
+          <w:b/>
+          <w:bCs/>
+        </w:rPr>
+      </w:pPr>
+    </w:p>
     <w:p>
       <w:pPr>
         <w:rPr>
@@ -159,7 +197,7 @@
                     <pic:cNvPicPr/>
                   </pic:nvPicPr>
                   <pic:blipFill>
-                    <a:blip r:embed="rId5"/>
+                    <a:blip r:embed="rId7"/>
                     <a:stretch>
                       <a:fillRect/>
                     </a:stretch>
@@ -252,32 +290,11 @@
           <w:b/>
           <w:bCs/>
         </w:rPr>
-        <w:t xml:space="preserve">Nom du </w:t>
-      </w:r>
-      <w:proofErr w:type="spellStart"/>
-      <w:r>
-        <w:rPr>
-          <w:b/>
-          <w:bCs/>
-        </w:rPr>
-        <w:t>keyspace</w:t>
-      </w:r>
-      <w:proofErr w:type="spellEnd"/>
-      <w:r>
-        <w:rPr>
-          <w:b/>
-          <w:bCs/>
-        </w:rPr>
-        <w:t xml:space="preserve"> :</w:t>
-      </w:r>
-      <w:r>
-        <w:t> </w:t>
-      </w:r>
-      <w:proofErr w:type="spellStart"/>
-      <w:r>
-        <w:t>velib_cluster</w:t>
-      </w:r>
-      <w:proofErr w:type="spellEnd"/>
+        <w:t>Nom du keyspace :</w:t>
+      </w:r>
+      <w:r>
+        <w:t> velib_cluster</w:t>
+      </w:r>
     </w:p>
     <w:p>
       <w:pPr>
@@ -294,15 +311,7 @@
         <w:t>Nom de la table :</w:t>
       </w:r>
       <w:r>
-        <w:t> </w:t>
-      </w:r>
-      <w:proofErr w:type="spellStart"/>
-      <w:r>
-        <w:t>stations_velib</w:t>
-      </w:r>
-      <w:proofErr w:type="spellEnd"/>
-      <w:r>
-        <w:t>, la disponibilité en temps réel des stations Vélib'</w:t>
+        <w:t> stations_velib, la disponibilité en temps réel des stations Vélib'</w:t>
       </w:r>
     </w:p>
     <w:p>
@@ -335,16 +344,12 @@
           <w:b/>
           <w:bCs/>
         </w:rPr>
+        <w:lastRenderedPageBreak/>
         <w:t>Partition key :</w:t>
       </w:r>
       <w:r>
-        <w:t> </w:t>
-      </w:r>
-      <w:proofErr w:type="spellStart"/>
-      <w:r>
-        <w:t>station_id</w:t>
-      </w:r>
-      <w:proofErr w:type="spellEnd"/>
+        <w:t> station_id</w:t>
+      </w:r>
     </w:p>
     <w:p>
       <w:pPr>
@@ -392,31 +397,17 @@
           <w:b/>
           <w:bCs/>
         </w:rPr>
-        <w:lastRenderedPageBreak/>
         <w:t>Question 4</w:t>
       </w:r>
     </w:p>
     <w:p>
       <w:r>
-        <w:t xml:space="preserve">Partitionnement : Répartir la donnée parmi plusieurs </w:t>
-      </w:r>
-      <w:proofErr w:type="spellStart"/>
-      <w:r>
-        <w:t>nodes</w:t>
-      </w:r>
-      <w:proofErr w:type="spellEnd"/>
-    </w:p>
-    <w:p>
-      <w:r>
-        <w:t xml:space="preserve">Réplication : Que les </w:t>
-      </w:r>
-      <w:proofErr w:type="spellStart"/>
-      <w:r>
-        <w:t>nodes</w:t>
-      </w:r>
-      <w:proofErr w:type="spellEnd"/>
-      <w:r>
-        <w:t xml:space="preserve"> soit </w:t>
+        <w:t>Partitionnement : Répartir la donnée parmi plusieurs nodes</w:t>
+      </w:r>
+    </w:p>
+    <w:p>
+      <w:r>
+        <w:t xml:space="preserve">Réplication : Que les nodes soit </w:t>
       </w:r>
       <w:r>
         <w:t>similaire</w:t>
@@ -515,33 +506,11 @@
           <w:lang w:val="en-US"/>
         </w:rPr>
       </w:pPr>
-      <w:proofErr w:type="spellStart"/>
       <w:r>
         <w:rPr>
           <w:lang w:val="en-US"/>
         </w:rPr>
-        <w:t>Nœud</w:t>
-      </w:r>
-      <w:proofErr w:type="spellEnd"/>
-      <w:r>
-        <w:rPr>
-          <w:lang w:val="en-US"/>
-        </w:rPr>
-        <w:t xml:space="preserve">(s) </w:t>
-      </w:r>
-      <w:proofErr w:type="spellStart"/>
-      <w:r>
-        <w:rPr>
-          <w:lang w:val="en-US"/>
-        </w:rPr>
-        <w:t>responsable</w:t>
-      </w:r>
-      <w:proofErr w:type="spellEnd"/>
-      <w:r>
-        <w:rPr>
-          <w:lang w:val="en-US"/>
-        </w:rPr>
-        <w:t>(s)</w:t>
+        <w:t>Nœud(s) responsable(s)</w:t>
       </w:r>
     </w:p>
     <w:p>
@@ -560,15 +529,7 @@
     <w:p/>
     <w:p>
       <w:r>
-        <w:t xml:space="preserve">Partition key : </w:t>
-      </w:r>
-      <w:proofErr w:type="spellStart"/>
-      <w:r>
-        <w:t>station_id</w:t>
-      </w:r>
-      <w:proofErr w:type="spellEnd"/>
-      <w:r>
-        <w:t xml:space="preserve"> = '15047'</w:t>
+        <w:t>Partition key : station_id = '15047'</w:t>
       </w:r>
     </w:p>
     <w:p>
@@ -577,24 +538,14 @@
       </w:r>
     </w:p>
     <w:p>
-      <w:proofErr w:type="spellStart"/>
-      <w:r>
-        <w:t>Token</w:t>
-      </w:r>
-      <w:proofErr w:type="spellEnd"/>
-      <w:r>
-        <w:t xml:space="preserve"> : -9181437804237570319, une position sur l'anneau</w:t>
-      </w:r>
-    </w:p>
-    <w:p>
-      <w:r>
-        <w:t xml:space="preserve">Nœud(s) responsable(s) : le nœud qui possède cette plage de </w:t>
-      </w:r>
-      <w:proofErr w:type="spellStart"/>
-      <w:r>
-        <w:t>tokens</w:t>
-      </w:r>
-      <w:proofErr w:type="spellEnd"/>
+      <w:r>
+        <w:t>Token : -9181437804237570319, une position sur l'anneau</w:t>
+      </w:r>
+    </w:p>
+    <w:p>
+      <w:r>
+        <w:t>Nœud(s) responsable(s) : le nœud qui possède cette plage de tokens</w:t>
+      </w:r>
     </w:p>
     <w:p>
       <w:r>
@@ -642,35 +593,35 @@
         <w:rPr>
           <w:lang w:val="en-US"/>
         </w:rPr>
-        <w:t xml:space="preserve">SELECT * FROM </w:t>
-      </w:r>
-      <w:proofErr w:type="spellStart"/>
-      <w:r>
+        <w:t>SELECT * FROM stations_velib WHERE station_id = '15047';</w:t>
+      </w:r>
+    </w:p>
+    <w:p>
+      <w:pPr>
+        <w:spacing w:line="240" w:lineRule="auto"/>
         <w:rPr>
           <w:lang w:val="en-US"/>
         </w:rPr>
-        <w:t>stations_velib</w:t>
-      </w:r>
-      <w:proofErr w:type="spellEnd"/>
+      </w:pPr>
       <w:r>
         <w:rPr>
           <w:lang w:val="en-US"/>
         </w:rPr>
-        <w:t xml:space="preserve"> WHERE </w:t>
-      </w:r>
-      <w:proofErr w:type="spellStart"/>
-      <w:r>
+        <w:t>CONSISTENCY QUORUM;</w:t>
+      </w:r>
+    </w:p>
+    <w:p>
+      <w:pPr>
+        <w:spacing w:line="240" w:lineRule="auto"/>
         <w:rPr>
           <w:lang w:val="en-US"/>
         </w:rPr>
-        <w:t>station_id</w:t>
-      </w:r>
-      <w:proofErr w:type="spellEnd"/>
+      </w:pPr>
       <w:r>
         <w:rPr>
           <w:lang w:val="en-US"/>
         </w:rPr>
-        <w:t xml:space="preserve"> = '15047';</w:t>
+        <w:t>SELECT * FROM stations_velib WHERE station_id = '15047';</w:t>
       </w:r>
     </w:p>
     <w:p>
@@ -680,158 +631,75 @@
           <w:lang w:val="en-US"/>
         </w:rPr>
       </w:pPr>
-    </w:p>
-    <w:p>
-      <w:pPr>
-        <w:spacing w:line="240" w:lineRule="auto"/>
+      <w:r>
         <w:rPr>
           <w:lang w:val="en-US"/>
         </w:rPr>
-      </w:pPr>
-      <w:r>
+        <w:t>CONSISTENCY ALL;</w:t>
+      </w:r>
+    </w:p>
+    <w:p>
+      <w:pPr>
+        <w:spacing w:line="240" w:lineRule="auto"/>
         <w:rPr>
           <w:lang w:val="en-US"/>
         </w:rPr>
-        <w:t>CONSISTENCY QUORUM;</w:t>
-      </w:r>
-    </w:p>
-    <w:p>
-      <w:pPr>
-        <w:spacing w:line="240" w:lineRule="auto"/>
+      </w:pPr>
+      <w:r>
         <w:rPr>
           <w:lang w:val="en-US"/>
         </w:rPr>
-      </w:pPr>
-      <w:r>
+        <w:t>SELECT * FROM stations_velib WHERE station_id = '15047';</w:t>
+      </w:r>
+    </w:p>
+    <w:p>
+      <w:pPr>
+        <w:spacing w:line="240" w:lineRule="auto"/>
         <w:rPr>
           <w:lang w:val="en-US"/>
         </w:rPr>
-        <w:t xml:space="preserve">SELECT * FROM </w:t>
-      </w:r>
-      <w:proofErr w:type="spellStart"/>
+      </w:pPr>
       <w:r>
         <w:rPr>
           <w:lang w:val="en-US"/>
         </w:rPr>
-        <w:t>stations_velib</w:t>
-      </w:r>
-      <w:proofErr w:type="spellEnd"/>
-      <w:r>
-        <w:rPr>
-          <w:lang w:val="en-US"/>
-        </w:rPr>
-        <w:t xml:space="preserve"> WHERE </w:t>
-      </w:r>
-      <w:proofErr w:type="spellStart"/>
-      <w:r>
-        <w:rPr>
-          <w:lang w:val="en-US"/>
-        </w:rPr>
-        <w:t>station_id</w:t>
-      </w:r>
-      <w:proofErr w:type="spellEnd"/>
-      <w:r>
-        <w:rPr>
-          <w:lang w:val="en-US"/>
-        </w:rPr>
-        <w:t xml:space="preserve"> = '15047';</w:t>
-      </w:r>
-    </w:p>
-    <w:p>
-      <w:pPr>
-        <w:spacing w:line="240" w:lineRule="auto"/>
-        <w:rPr>
-          <w:lang w:val="en-US"/>
-        </w:rPr>
-      </w:pPr>
-    </w:p>
-    <w:p>
-      <w:pPr>
-        <w:spacing w:line="240" w:lineRule="auto"/>
-        <w:rPr>
-          <w:lang w:val="en-US"/>
-        </w:rPr>
-      </w:pPr>
-      <w:r>
-        <w:rPr>
-          <w:lang w:val="en-US"/>
-        </w:rPr>
-        <w:t>CONSISTENCY ALL;</w:t>
-      </w:r>
-    </w:p>
-    <w:p>
-      <w:pPr>
-        <w:spacing w:line="240" w:lineRule="auto"/>
-        <w:rPr>
-          <w:lang w:val="en-US"/>
-        </w:rPr>
-      </w:pPr>
-      <w:r>
-        <w:rPr>
-          <w:lang w:val="en-US"/>
-        </w:rPr>
-        <w:t xml:space="preserve">SELECT * FROM </w:t>
-      </w:r>
-      <w:proofErr w:type="spellStart"/>
-      <w:r>
-        <w:rPr>
-          <w:lang w:val="en-US"/>
-        </w:rPr>
-        <w:t>stations_velib</w:t>
-      </w:r>
-      <w:proofErr w:type="spellEnd"/>
-      <w:r>
-        <w:rPr>
-          <w:lang w:val="en-US"/>
-        </w:rPr>
-        <w:t xml:space="preserve"> WHERE </w:t>
-      </w:r>
-      <w:proofErr w:type="spellStart"/>
-      <w:r>
-        <w:rPr>
-          <w:lang w:val="en-US"/>
-        </w:rPr>
-        <w:t>station_id</w:t>
-      </w:r>
-      <w:proofErr w:type="spellEnd"/>
-      <w:r>
-        <w:rPr>
-          <w:lang w:val="en-US"/>
-        </w:rPr>
-        <w:t xml:space="preserve"> = '15047';</w:t>
-      </w:r>
-    </w:p>
-    <w:p>
-      <w:pPr>
-        <w:spacing w:line="240" w:lineRule="auto"/>
-        <w:rPr>
-          <w:lang w:val="en-US"/>
-        </w:rPr>
-      </w:pPr>
-    </w:p>
-    <w:p>
-      <w:pPr>
-        <w:spacing w:line="240" w:lineRule="auto"/>
-        <w:rPr>
-          <w:lang w:val="en-US"/>
-        </w:rPr>
-      </w:pPr>
-    </w:p>
-    <w:p>
-      <w:pPr>
-        <w:spacing w:line="240" w:lineRule="auto"/>
-        <w:rPr>
-          <w:lang w:val="en-US"/>
-        </w:rPr>
-      </w:pPr>
-    </w:p>
-    <w:p>
-      <w:pPr>
-        <w:spacing w:line="240" w:lineRule="auto"/>
-        <w:rPr>
-          <w:lang w:val="en-US"/>
-        </w:rPr>
-      </w:pPr>
+        <w:lastRenderedPageBreak/>
+        <w:drawing>
+          <wp:inline distT="0" distB="0" distL="0" distR="0" wp14:anchorId="143752B3" wp14:editId="74C6E9A3">
+            <wp:extent cx="5760720" cy="1981835"/>
+            <wp:effectExtent l="0" t="0" r="0" b="0"/>
+            <wp:docPr id="2" name="Image 2"/>
+            <wp:cNvGraphicFramePr>
+              <a:graphicFrameLocks xmlns:a="http://schemas.openxmlformats.org/drawingml/2006/main" noChangeAspect="1"/>
+            </wp:cNvGraphicFramePr>
+            <a:graphic xmlns:a="http://schemas.openxmlformats.org/drawingml/2006/main">
+              <a:graphicData uri="http://schemas.openxmlformats.org/drawingml/2006/picture">
+                <pic:pic xmlns:pic="http://schemas.openxmlformats.org/drawingml/2006/picture">
+                  <pic:nvPicPr>
+                    <pic:cNvPr id="1" name=""/>
+                    <pic:cNvPicPr/>
+                  </pic:nvPicPr>
+                  <pic:blipFill>
+                    <a:blip r:embed="rId8"/>
+                    <a:stretch>
+                      <a:fillRect/>
+                    </a:stretch>
+                  </pic:blipFill>
+                  <pic:spPr>
+                    <a:xfrm>
+                      <a:off x="0" y="0"/>
+                      <a:ext cx="5760720" cy="1981835"/>
+                    </a:xfrm>
+                    <a:prstGeom prst="rect">
+                      <a:avLst/>
+                    </a:prstGeom>
+                  </pic:spPr>
+                </pic:pic>
+              </a:graphicData>
+            </a:graphic>
+          </wp:inline>
+        </w:drawing>
+      </w:r>
     </w:p>
     <w:p>
       <w:pPr>
@@ -862,7 +730,6 @@
           <w:b/>
           <w:bCs/>
         </w:rPr>
-        <w:lastRenderedPageBreak/>
         <w:t xml:space="preserve">Question 6 : </w:t>
       </w:r>
     </w:p>
@@ -1016,21 +883,8 @@
         <w:spacing w:line="240" w:lineRule="auto"/>
       </w:pPr>
       <w:r>
-        <w:t>En cas de panne : échoue dès qu'un seul nœud est en panne (</w:t>
-      </w:r>
-      <w:proofErr w:type="spellStart"/>
-      <w:r>
-        <w:t>Unavailable</w:t>
-      </w:r>
-      <w:proofErr w:type="spellEnd"/>
-      <w:r>
-        <w:t>).</w:t>
-      </w:r>
-    </w:p>
-    <w:p>
-      <w:pPr>
-        <w:spacing w:line="240" w:lineRule="auto"/>
-      </w:pPr>
+        <w:t>En cas de panne : échoue dès qu'un seul nœud est en panne (Unavailable).</w:t>
+      </w:r>
     </w:p>
     <w:p>
       <w:pPr>
@@ -1123,6 +977,96 @@
     <w:p>
       <w:pPr>
         <w:spacing w:line="240" w:lineRule="auto"/>
+      </w:pPr>
+      <w:r>
+        <w:drawing>
+          <wp:inline distT="0" distB="0" distL="0" distR="0" wp14:anchorId="4D1BC434" wp14:editId="7D837BDC">
+            <wp:extent cx="5760720" cy="392430"/>
+            <wp:effectExtent l="0" t="0" r="0" b="7620"/>
+            <wp:docPr id="3" name="Image 3"/>
+            <wp:cNvGraphicFramePr>
+              <a:graphicFrameLocks xmlns:a="http://schemas.openxmlformats.org/drawingml/2006/main" noChangeAspect="1"/>
+            </wp:cNvGraphicFramePr>
+            <a:graphic xmlns:a="http://schemas.openxmlformats.org/drawingml/2006/main">
+              <a:graphicData uri="http://schemas.openxmlformats.org/drawingml/2006/picture">
+                <pic:pic xmlns:pic="http://schemas.openxmlformats.org/drawingml/2006/picture">
+                  <pic:nvPicPr>
+                    <pic:cNvPr id="1" name=""/>
+                    <pic:cNvPicPr/>
+                  </pic:nvPicPr>
+                  <pic:blipFill>
+                    <a:blip r:embed="rId9"/>
+                    <a:stretch>
+                      <a:fillRect/>
+                    </a:stretch>
+                  </pic:blipFill>
+                  <pic:spPr>
+                    <a:xfrm>
+                      <a:off x="0" y="0"/>
+                      <a:ext cx="5760720" cy="392430"/>
+                    </a:xfrm>
+                    <a:prstGeom prst="rect">
+                      <a:avLst/>
+                    </a:prstGeom>
+                  </pic:spPr>
+                </pic:pic>
+              </a:graphicData>
+            </a:graphic>
+          </wp:inline>
+        </w:drawing>
+      </w:r>
+    </w:p>
+    <w:p>
+      <w:pPr>
+        <w:spacing w:line="240" w:lineRule="auto"/>
+      </w:pPr>
+      <w:r>
+        <w:lastRenderedPageBreak/>
+        <w:drawing>
+          <wp:inline distT="0" distB="0" distL="0" distR="0" wp14:anchorId="0DF6D72F" wp14:editId="008642EF">
+            <wp:extent cx="5760720" cy="2534920"/>
+            <wp:effectExtent l="0" t="0" r="0" b="0"/>
+            <wp:docPr id="4" name="Image 4"/>
+            <wp:cNvGraphicFramePr>
+              <a:graphicFrameLocks xmlns:a="http://schemas.openxmlformats.org/drawingml/2006/main" noChangeAspect="1"/>
+            </wp:cNvGraphicFramePr>
+            <a:graphic xmlns:a="http://schemas.openxmlformats.org/drawingml/2006/main">
+              <a:graphicData uri="http://schemas.openxmlformats.org/drawingml/2006/picture">
+                <pic:pic xmlns:pic="http://schemas.openxmlformats.org/drawingml/2006/picture">
+                  <pic:nvPicPr>
+                    <pic:cNvPr id="1" name=""/>
+                    <pic:cNvPicPr/>
+                  </pic:nvPicPr>
+                  <pic:blipFill>
+                    <a:blip r:embed="rId10"/>
+                    <a:stretch>
+                      <a:fillRect/>
+                    </a:stretch>
+                  </pic:blipFill>
+                  <pic:spPr>
+                    <a:xfrm>
+                      <a:off x="0" y="0"/>
+                      <a:ext cx="5760720" cy="2534920"/>
+                    </a:xfrm>
+                    <a:prstGeom prst="rect">
+                      <a:avLst/>
+                    </a:prstGeom>
+                  </pic:spPr>
+                </pic:pic>
+              </a:graphicData>
+            </a:graphic>
+          </wp:inline>
+        </w:drawing>
+      </w:r>
+    </w:p>
+    <w:p>
+      <w:pPr>
+        <w:spacing w:line="240" w:lineRule="auto"/>
+      </w:pPr>
+    </w:p>
+    <w:p>
+      <w:pPr>
+        <w:spacing w:line="240" w:lineRule="auto"/>
         <w:rPr>
           <w:b/>
           <w:bCs/>
@@ -1133,6 +1077,149 @@
           <w:b/>
           <w:bCs/>
         </w:rPr>
+        <w:t xml:space="preserve">Question 9 : </w:t>
+      </w:r>
+    </w:p>
+    <w:p>
+      <w:pPr>
+        <w:spacing w:line="240" w:lineRule="auto"/>
+        <w:rPr>
+          <w:b/>
+          <w:bCs/>
+        </w:rPr>
+      </w:pPr>
+      <w:r>
+        <w:t>A</w:t>
+      </w:r>
+      <w:r>
+        <w:t>près redémarrage de cass3</w:t>
+      </w:r>
+    </w:p>
+    <w:p>
+      <w:pPr>
+        <w:spacing w:line="240" w:lineRule="auto"/>
+      </w:pPr>
+      <w:proofErr w:type="gramStart"/>
+      <w:r>
+        <w:t>docker</w:t>
+      </w:r>
+      <w:proofErr w:type="gramEnd"/>
+      <w:r>
+        <w:t xml:space="preserve"> start cass3</w:t>
+      </w:r>
+    </w:p>
+    <w:p>
+      <w:pPr>
+        <w:spacing w:line="240" w:lineRule="auto"/>
+        <w:rPr>
+          <w:lang w:val="en-US"/>
+        </w:rPr>
+      </w:pPr>
+      <w:r>
+        <w:rPr>
+          <w:lang w:val="en-US"/>
+        </w:rPr>
+        <w:t>docker exec -it cass1 nodetool status</w:t>
+      </w:r>
+    </w:p>
+    <w:p>
+      <w:pPr>
+        <w:spacing w:line="240" w:lineRule="auto"/>
+      </w:pPr>
+      <w:proofErr w:type="gramStart"/>
+      <w:r>
+        <w:t>UN  172.23.0.3</w:t>
+      </w:r>
+      <w:proofErr w:type="gramEnd"/>
+      <w:r>
+        <w:t xml:space="preserve">  ...  </w:t>
+      </w:r>
+      <w:proofErr w:type="gramStart"/>
+      <w:r>
+        <w:t>rack</w:t>
+      </w:r>
+      <w:proofErr w:type="gramEnd"/>
+      <w:r>
+        <w:t>1   ← cass1</w:t>
+      </w:r>
+    </w:p>
+    <w:p>
+      <w:pPr>
+        <w:spacing w:line="240" w:lineRule="auto"/>
+      </w:pPr>
+      <w:proofErr w:type="gramStart"/>
+      <w:r>
+        <w:t>UN  172.23.0.4</w:t>
+      </w:r>
+      <w:proofErr w:type="gramEnd"/>
+      <w:r>
+        <w:t xml:space="preserve">  ...  </w:t>
+      </w:r>
+      <w:proofErr w:type="gramStart"/>
+      <w:r>
+        <w:t>rack</w:t>
+      </w:r>
+      <w:proofErr w:type="gramEnd"/>
+      <w:r>
+        <w:t>3   ← cass3</w:t>
+      </w:r>
+    </w:p>
+    <w:p>
+      <w:pPr>
+        <w:spacing w:line="240" w:lineRule="auto"/>
+      </w:pPr>
+      <w:proofErr w:type="gramStart"/>
+      <w:r>
+        <w:t>UN  172.23.0.2</w:t>
+      </w:r>
+      <w:proofErr w:type="gramEnd"/>
+      <w:r>
+        <w:t xml:space="preserve">  ...  </w:t>
+      </w:r>
+      <w:proofErr w:type="gramStart"/>
+      <w:r>
+        <w:t>rack</w:t>
+      </w:r>
+      <w:proofErr w:type="gramEnd"/>
+      <w:r>
+        <w:t>2   ← cass2</w:t>
+      </w:r>
+    </w:p>
+    <w:p>
+      <w:pPr>
+        <w:spacing w:line="240" w:lineRule="auto"/>
+      </w:pPr>
+      <w:r>
+        <w:t>Oui, cass3 revient dans le cluster automatiquement après docker start, sans aucune reconfiguration.</w:t>
+      </w:r>
+    </w:p>
+    <w:p>
+      <w:pPr>
+        <w:spacing w:line="240" w:lineRule="auto"/>
+      </w:pPr>
+      <w:r>
+        <w:t>Son nouvel état est UN : il passe de DN à UN, avec le même Host ID et le même rack (rack3).</w:t>
+      </w:r>
+      <w:r>
+        <w:t xml:space="preserve"> </w:t>
+      </w:r>
+      <w:r>
+        <w:t>La lecture en ALL fonctionne de nouveau.</w:t>
+      </w:r>
+    </w:p>
+    <w:p>
+      <w:pPr>
+        <w:spacing w:line="240" w:lineRule="auto"/>
+        <w:rPr>
+          <w:b/>
+          <w:bCs/>
+        </w:rPr>
+      </w:pPr>
+      <w:r>
+        <w:rPr>
+          <w:b/>
+          <w:bCs/>
+        </w:rPr>
         <w:t>Question 11</w:t>
       </w:r>
     </w:p>
@@ -1149,23 +1236,7 @@
         <w:spacing w:line="240" w:lineRule="auto"/>
       </w:pPr>
       <w:r>
-        <w:t xml:space="preserve">Car la réplication, permet que les 3 </w:t>
-      </w:r>
-      <w:proofErr w:type="spellStart"/>
-      <w:r>
-        <w:t>nodes</w:t>
-      </w:r>
-      <w:proofErr w:type="spellEnd"/>
-      <w:r>
-        <w:t xml:space="preserve"> soient identiques au niveau du contenu de leurs information. Si une des </w:t>
-      </w:r>
-      <w:proofErr w:type="spellStart"/>
-      <w:r>
-        <w:t>nodes</w:t>
-      </w:r>
-      <w:proofErr w:type="spellEnd"/>
-      <w:r>
-        <w:t xml:space="preserve"> tombe en panne les deux autres prennent le relais.</w:t>
+        <w:t>Car la réplication, permet que les 3 nodes soient identiques au niveau du contenu de leurs information. Si une des nodes tombe en panne les deux autres prennent le relais.</w:t>
       </w:r>
     </w:p>
     <w:p>
@@ -1185,6 +1256,56 @@
 </w:document>
 </file>
 
+<file path=word/endnotes.xml><?xml version="1.0" encoding="utf-8"?>
+<w:endnotes xmlns:wpc="http://schemas.microsoft.com/office/word/2010/wordprocessingCanvas" xmlns:cx="http://schemas.microsoft.com/office/drawing/2014/chartex" xmlns:cx1="http://schemas.microsoft.com/office/drawing/2015/9/8/chartex" xmlns:cx2="http://schemas.microsoft.com/office/drawing/2015/10/21/chartex" xmlns:cx3="http://schemas.microsoft.com/office/drawing/2016/5/9/chartex" xmlns:cx4="http://schemas.microsoft.com/office/drawing/2016/5/10/chartex" xmlns:cx5="http://schemas.microsoft.com/office/drawing/2016/5/11/chartex" xmlns:cx6="http://schemas.microsoft.com/office/drawing/2016/5/12/chartex" xmlns:cx7="http://schemas.microsoft.com/office/drawing/2016/5/13/chartex" xmlns:cx8="http://schemas.microsoft.com/office/drawing/2016/5/14/chartex" xmlns:mc="http://schemas.openxmlformats.org/markup-compatibility/2006" xmlns:aink="http://schemas.microsoft.com/office/drawing/2016/ink" xmlns:am3d="http://schemas.microsoft.com/office/drawing/2017/model3d" xmlns:o="urn:schemas-microsoft-com:office:office" xmlns:oel="http://schemas.microsoft.com/office/2019/extlst" xmlns:r="http://schemas.openxmlformats.org/officeDocument/2006/relationships" xmlns:m="http://schemas.openxmlformats.org/officeDocument/2006/math" xmlns:v="urn:schemas-microsoft-com:vml" xmlns:wp14="http://schemas.microsoft.com/office/word/2010/wordprocessingDrawing" xmlns:wp="http://schemas.openxmlformats.org/drawingml/2006/wordprocessingDrawing" xmlns:w10="urn:schemas-microsoft-com:office:word" xmlns:w="http://schemas.openxmlformats.org/wordprocessingml/2006/main" xmlns:w14="http://schemas.microsoft.com/office/word/2010/wordml" xmlns:w15="http://schemas.microsoft.com/office/word/2012/wordml" xmlns:w16cex="http://schemas.microsoft.com/office/word/2018/wordml/cex" xmlns:w16cid="http://schemas.microsoft.com/office/word/2016/wordml/cid" xmlns:w16="http://schemas.microsoft.com/office/word/2018/wordml" xmlns:w16sdtdh="http://schemas.microsoft.com/office/word/2020/wordml/sdtdatahash" xmlns:w16se="http://schemas.microsoft.com/office/word/2015/wordml/symex" xmlns:wpg="http://schemas.microsoft.com/office/word/2010/wordprocessingGroup" xmlns:wpi="http://schemas.microsoft.com/office/word/2010/wordprocessingInk" xmlns:wne="http://schemas.microsoft.com/office/word/2006/wordml" xmlns:wps="http://schemas.microsoft.com/office/word/2010/wordprocessingShape" mc:Ignorable="w14 w15 w16se w16cid w16 w16cex w16sdtdh wp14">
+  <w:endnote w:type="separator" w:id="-1">
+    <w:p>
+      <w:pPr>
+        <w:spacing w:after="0" w:line="240" w:lineRule="auto"/>
+      </w:pPr>
+      <w:r>
+        <w:separator/>
+      </w:r>
+    </w:p>
+  </w:endnote>
+  <w:endnote w:type="continuationSeparator" w:id="0">
+    <w:p>
+      <w:pPr>
+        <w:spacing w:after="0" w:line="240" w:lineRule="auto"/>
+      </w:pPr>
+      <w:r>
+        <w:continuationSeparator/>
+      </w:r>
+    </w:p>
+  </w:endnote>
+</w:endnotes>
+</file>
+
+<file path=word/footnotes.xml><?xml version="1.0" encoding="utf-8"?>
+<w:footnotes xmlns:wpc="http://schemas.microsoft.com/office/word/2010/wordprocessingCanvas" xmlns:cx="http://schemas.microsoft.com/office/drawing/2014/chartex" xmlns:cx1="http://schemas.microsoft.com/office/drawing/2015/9/8/chartex" xmlns:cx2="http://schemas.microsoft.com/office/drawing/2015/10/21/chartex" xmlns:cx3="http://schemas.microsoft.com/office/drawing/2016/5/9/chartex" xmlns:cx4="http://schemas.microsoft.com/office/drawing/2016/5/10/chartex" xmlns:cx5="http://schemas.microsoft.com/office/drawing/2016/5/11/chartex" xmlns:cx6="http://schemas.microsoft.com/office/drawing/2016/5/12/chartex" xmlns:cx7="http://schemas.microsoft.com/office/drawing/2016/5/13/chartex" xmlns:cx8="http://schemas.microsoft.com/office/drawing/2016/5/14/chartex" xmlns:mc="http://schemas.openxmlformats.org/markup-compatibility/2006" xmlns:aink="http://schemas.microsoft.com/office/drawing/2016/ink" xmlns:am3d="http://schemas.microsoft.com/office/drawing/2017/model3d" xmlns:o="urn:schemas-microsoft-com:office:office" xmlns:oel="http://schemas.microsoft.com/office/2019/extlst" xmlns:r="http://schemas.openxmlformats.org/officeDocument/2006/relationships" xmlns:m="http://schemas.openxmlformats.org/officeDocument/2006/math" xmlns:v="urn:schemas-microsoft-com:vml" xmlns:wp14="http://schemas.microsoft.com/office/word/2010/wordprocessingDrawing" xmlns:wp="http://schemas.openxmlformats.org/drawingml/2006/wordprocessingDrawing" xmlns:w10="urn:schemas-microsoft-com:office:word" xmlns:w="http://schemas.openxmlformats.org/wordprocessingml/2006/main" xmlns:w14="http://schemas.microsoft.com/office/word/2010/wordml" xmlns:w15="http://schemas.microsoft.com/office/word/2012/wordml" xmlns:w16cex="http://schemas.microsoft.com/office/word/2018/wordml/cex" xmlns:w16cid="http://schemas.microsoft.com/office/word/2016/wordml/cid" xmlns:w16="http://schemas.microsoft.com/office/word/2018/wordml" xmlns:w16sdtdh="http://schemas.microsoft.com/office/word/2020/wordml/sdtdatahash" xmlns:w16se="http://schemas.microsoft.com/office/word/2015/wordml/symex" xmlns:wpg="http://schemas.microsoft.com/office/word/2010/wordprocessingGroup" xmlns:wpi="http://schemas.microsoft.com/office/word/2010/wordprocessingInk" xmlns:wne="http://schemas.microsoft.com/office/word/2006/wordml" xmlns:wps="http://schemas.microsoft.com/office/word/2010/wordprocessingShape" mc:Ignorable="w14 w15 w16se w16cid w16 w16cex w16sdtdh wp14">
+  <w:footnote w:type="separator" w:id="-1">
+    <w:p>
+      <w:pPr>
+        <w:spacing w:after="0" w:line="240" w:lineRule="auto"/>
+      </w:pPr>
+      <w:r>
+        <w:separator/>
+      </w:r>
+    </w:p>
+  </w:footnote>
+  <w:footnote w:type="continuationSeparator" w:id="0">
+    <w:p>
+      <w:pPr>
+        <w:spacing w:after="0" w:line="240" w:lineRule="auto"/>
+      </w:pPr>
+      <w:r>
+        <w:continuationSeparator/>
+      </w:r>
+    </w:p>
+  </w:footnote>
+</w:footnotes>
+</file>
+
 <file path=word/numbering.xml><?xml version="1.0" encoding="utf-8"?>
 <w:numbering xmlns:wpc="http://schemas.microsoft.com/office/word/2010/wordprocessingCanvas" xmlns:cx="http://schemas.microsoft.com/office/drawing/2014/chartex" xmlns:cx1="http://schemas.microsoft.com/office/drawing/2015/9/8/chartex" xmlns:cx2="http://schemas.microsoft.com/office/drawing/2015/10/21/chartex" xmlns:cx3="http://schemas.microsoft.com/office/drawing/2016/5/9/chartex" xmlns:cx4="http://schemas.microsoft.com/office/drawing/2016/5/10/chartex" xmlns:cx5="http://schemas.microsoft.com/office/drawing/2016/5/11/chartex" xmlns:cx6="http://schemas.microsoft.com/office/drawing/2016/5/12/chartex" xmlns:cx7="http://schemas.microsoft.com/office/drawing/2016/5/13/chartex" xmlns:cx8="http://schemas.microsoft.com/office/drawing/2016/5/14/chartex" xmlns:mc="http://schemas.openxmlformats.org/markup-compatibility/2006" xmlns:aink="http://schemas.microsoft.com/office/drawing/2016/ink" xmlns:am3d="http://schemas.microsoft.com/office/drawing/2017/model3d" xmlns:o="urn:schemas-microsoft-com:office:office" xmlns:oel="http://schemas.microsoft.com/office/2019/extlst" xmlns:r="http://schemas.openxmlformats.org/officeDocument/2006/relationships" xmlns:m="http://schemas.openxmlformats.org/officeDocument/2006/math" xmlns:v="urn:schemas-microsoft-com:vml" xmlns:wp14="http://schemas.microsoft.com/office/word/2010/wordprocessingDrawing" xmlns:wp="http://schemas.openxmlformats.org/drawingml/2006/wordprocessingDrawing" xmlns:w10="urn:schemas-microsoft-com:office:word" xmlns:w="http://schemas.openxmlformats.org/wordprocessingml/2006/main" xmlns:w14="http://schemas.microsoft.com/office/word/2010/wordml" xmlns:w15="http://schemas.microsoft.com/office/word/2012/wordml" xmlns:w16cex="http://schemas.microsoft.com/office/word/2018/wordml/cex" xmlns:w16cid="http://schemas.microsoft.com/office/word/2016/wordml/cid" xmlns:w16="http://schemas.microsoft.com/office/word/2018/wordml" xmlns:w16sdtdh="http://schemas.microsoft.com/office/word/2020/wordml/sdtdatahash" xmlns:w16se="http://schemas.microsoft.com/office/word/2015/wordml/symex" xmlns:wpg="http://schemas.microsoft.com/office/word/2010/wordprocessingGroup" xmlns:wpi="http://schemas.microsoft.com/office/word/2010/wordprocessingInk" xmlns:wne="http://schemas.microsoft.com/office/word/2006/wordml" xmlns:wps="http://schemas.microsoft.com/office/word/2010/wordprocessingShape" mc:Ignorable="w14 w15 w16se w16cid w16 w16cex w16sdtdh wp14">
   <w:abstractNum w:abstractNumId="0" w15:restartNumberingAfterBreak="0">
@@ -1486,6 +1607,119 @@
     </w:lvl>
   </w:abstractNum>
   <w:abstractNum w:abstractNumId="2" w15:restartNumberingAfterBreak="0">
+    <w:nsid w:val="171B2BC8"/>
+    <w:multiLevelType w:val="multilevel"/>
+    <w:tmpl w:val="9D52C062"/>
+    <w:lvl w:ilvl="0">
+      <w:start w:val="1"/>
+      <w:numFmt w:val="decimal"/>
+      <w:lvlText w:val="%1."/>
+      <w:lvlJc w:val="left"/>
+      <w:pPr>
+        <w:tabs>
+          <w:tab w:val="num" w:pos="720"/>
+        </w:tabs>
+        <w:ind w:left="720" w:hanging="360"/>
+      </w:pPr>
+    </w:lvl>
+    <w:lvl w:ilvl="1" w:tentative="1">
+      <w:start w:val="1"/>
+      <w:numFmt w:val="decimal"/>
+      <w:lvlText w:val="%2."/>
+      <w:lvlJc w:val="left"/>
+      <w:pPr>
+        <w:tabs>
+          <w:tab w:val="num" w:pos="1440"/>
+        </w:tabs>
+        <w:ind w:left="1440" w:hanging="360"/>
+      </w:pPr>
+    </w:lvl>
+    <w:lvl w:ilvl="2" w:tentative="1">
+      <w:start w:val="1"/>
+      <w:numFmt w:val="decimal"/>
+      <w:lvlText w:val="%3."/>
+      <w:lvlJc w:val="left"/>
+      <w:pPr>
+        <w:tabs>
+          <w:tab w:val="num" w:pos="2160"/>
+        </w:tabs>
+        <w:ind w:left="2160" w:hanging="360"/>
+      </w:pPr>
+    </w:lvl>
+    <w:lvl w:ilvl="3" w:tentative="1">
+      <w:start w:val="1"/>
+      <w:numFmt w:val="decimal"/>
+      <w:lvlText w:val="%4."/>
+      <w:lvlJc w:val="left"/>
+      <w:pPr>
+        <w:tabs>
+          <w:tab w:val="num" w:pos="2880"/>
+        </w:tabs>
+        <w:ind w:left="2880" w:hanging="360"/>
+      </w:pPr>
+    </w:lvl>
+    <w:lvl w:ilvl="4" w:tentative="1">
+      <w:start w:val="1"/>
+      <w:numFmt w:val="decimal"/>
+      <w:lvlText w:val="%5."/>
+      <w:lvlJc w:val="left"/>
+      <w:pPr>
+        <w:tabs>
+          <w:tab w:val="num" w:pos="3600"/>
+        </w:tabs>
+        <w:ind w:left="3600" w:hanging="360"/>
+      </w:pPr>
+    </w:lvl>
+    <w:lvl w:ilvl="5" w:tentative="1">
+      <w:start w:val="1"/>
+      <w:numFmt w:val="decimal"/>
+      <w:lvlText w:val="%6."/>
+      <w:lvlJc w:val="left"/>
+      <w:pPr>
+        <w:tabs>
+          <w:tab w:val="num" w:pos="4320"/>
+        </w:tabs>
+        <w:ind w:left="4320" w:hanging="360"/>
+      </w:pPr>
+    </w:lvl>
+    <w:lvl w:ilvl="6" w:tentative="1">
+      <w:start w:val="1"/>
+      <w:numFmt w:val="decimal"/>
+      <w:lvlText w:val="%7."/>
+      <w:lvlJc w:val="left"/>
+      <w:pPr>
+        <w:tabs>
+          <w:tab w:val="num" w:pos="5040"/>
+        </w:tabs>
+        <w:ind w:left="5040" w:hanging="360"/>
+      </w:pPr>
+    </w:lvl>
+    <w:lvl w:ilvl="7" w:tentative="1">
+      <w:start w:val="1"/>
+      <w:numFmt w:val="decimal"/>
+      <w:lvlText w:val="%8."/>
+      <w:lvlJc w:val="left"/>
+      <w:pPr>
+        <w:tabs>
+          <w:tab w:val="num" w:pos="5760"/>
+        </w:tabs>
+        <w:ind w:left="5760" w:hanging="360"/>
+      </w:pPr>
+    </w:lvl>
+    <w:lvl w:ilvl="8" w:tentative="1">
+      <w:start w:val="1"/>
+      <w:numFmt w:val="decimal"/>
+      <w:lvlText w:val="%9."/>
+      <w:lvlJc w:val="left"/>
+      <w:pPr>
+        <w:tabs>
+          <w:tab w:val="num" w:pos="6480"/>
+        </w:tabs>
+        <w:ind w:left="6480" w:hanging="360"/>
+      </w:pPr>
+    </w:lvl>
+  </w:abstractNum>
+  <w:abstractNum w:abstractNumId="3" w15:restartNumberingAfterBreak="0">
     <w:nsid w:val="19C021ED"/>
     <w:multiLevelType w:val="hybridMultilevel"/>
     <w:tmpl w:val="5B540A28"/>
@@ -1598,7 +1832,7 @@
       </w:rPr>
     </w:lvl>
   </w:abstractNum>
-  <w:abstractNum w:abstractNumId="3" w15:restartNumberingAfterBreak="0">
+  <w:abstractNum w:abstractNumId="4" w15:restartNumberingAfterBreak="0">
     <w:nsid w:val="1B816A55"/>
     <w:multiLevelType w:val="multilevel"/>
     <w:tmpl w:val="0F128B70"/>
@@ -1747,7 +1981,7 @@
       </w:rPr>
     </w:lvl>
   </w:abstractNum>
-  <w:abstractNum w:abstractNumId="4" w15:restartNumberingAfterBreak="0">
+  <w:abstractNum w:abstractNumId="5" w15:restartNumberingAfterBreak="0">
     <w:nsid w:val="3EDE13BE"/>
     <w:multiLevelType w:val="multilevel"/>
     <w:tmpl w:val="1A383264"/>
@@ -1896,7 +2130,7 @@
       </w:rPr>
     </w:lvl>
   </w:abstractNum>
-  <w:abstractNum w:abstractNumId="5" w15:restartNumberingAfterBreak="0">
+  <w:abstractNum w:abstractNumId="6" w15:restartNumberingAfterBreak="0">
     <w:nsid w:val="53DD198F"/>
     <w:multiLevelType w:val="multilevel"/>
     <w:tmpl w:val="82EADA42"/>
@@ -2045,7 +2279,7 @@
       </w:rPr>
     </w:lvl>
   </w:abstractNum>
-  <w:abstractNum w:abstractNumId="6" w15:restartNumberingAfterBreak="0">
+  <w:abstractNum w:abstractNumId="7" w15:restartNumberingAfterBreak="0">
     <w:nsid w:val="61FF31D9"/>
     <w:multiLevelType w:val="hybridMultilevel"/>
     <w:tmpl w:val="9E2A350E"/>
@@ -2158,7 +2392,7 @@
       </w:rPr>
     </w:lvl>
   </w:abstractNum>
-  <w:abstractNum w:abstractNumId="7" w15:restartNumberingAfterBreak="0">
+  <w:abstractNum w:abstractNumId="8" w15:restartNumberingAfterBreak="0">
     <w:nsid w:val="6CC92E60"/>
     <w:multiLevelType w:val="multilevel"/>
     <w:tmpl w:val="9A5A1662"/>
@@ -2307,7 +2541,7 @@
       </w:rPr>
     </w:lvl>
   </w:abstractNum>
-  <w:abstractNum w:abstractNumId="8" w15:restartNumberingAfterBreak="0">
+  <w:abstractNum w:abstractNumId="9" w15:restartNumberingAfterBreak="0">
     <w:nsid w:val="790B7EFE"/>
     <w:multiLevelType w:val="multilevel"/>
     <w:tmpl w:val="6944D67C"/>
@@ -2457,31 +2691,34 @@
     </w:lvl>
   </w:abstractNum>
   <w:num w:numId="1" w16cid:durableId="2054189906">
+    <w:abstractNumId w:val="8"/>
+  </w:num>
+  <w:num w:numId="2" w16cid:durableId="1484617619">
+    <w:abstractNumId w:val="4"/>
+  </w:num>
+  <w:num w:numId="3" w16cid:durableId="346366291">
+    <w:abstractNumId w:val="3"/>
+  </w:num>
+  <w:num w:numId="4" w16cid:durableId="65804811">
     <w:abstractNumId w:val="7"/>
   </w:num>
-  <w:num w:numId="2" w16cid:durableId="1484617619">
-    <w:abstractNumId w:val="3"/>
-  </w:num>
-  <w:num w:numId="3" w16cid:durableId="346366291">
-    <w:abstractNumId w:val="2"/>
-  </w:num>
-  <w:num w:numId="4" w16cid:durableId="65804811">
-    <w:abstractNumId w:val="6"/>
-  </w:num>
   <w:num w:numId="5" w16cid:durableId="1073821500">
-    <w:abstractNumId w:val="4"/>
+    <w:abstractNumId w:val="5"/>
   </w:num>
   <w:num w:numId="6" w16cid:durableId="1154222349">
     <w:abstractNumId w:val="0"/>
   </w:num>
   <w:num w:numId="7" w16cid:durableId="166408810">
-    <w:abstractNumId w:val="8"/>
+    <w:abstractNumId w:val="9"/>
   </w:num>
   <w:num w:numId="8" w16cid:durableId="1682511956">
-    <w:abstractNumId w:val="5"/>
+    <w:abstractNumId w:val="6"/>
   </w:num>
   <w:num w:numId="9" w16cid:durableId="2122722538">
     <w:abstractNumId w:val="1"/>
+  </w:num>
+  <w:num w:numId="10" w16cid:durableId="218787957">
+    <w:abstractNumId w:val="2"/>
   </w:num>
 </w:numbering>
 </file>
@@ -2914,7 +3151,6 @@
     <w:next w:val="Normal"/>
     <w:link w:val="Titre2Car"/>
     <w:uiPriority w:val="9"/>
-    <w:semiHidden/>
     <w:unhideWhenUsed/>
     <w:qFormat/>
     <w:rsid w:val="003E0190"/>
@@ -3130,7 +3366,6 @@
     <w:basedOn w:val="Policepardfaut"/>
     <w:link w:val="Titre2"/>
     <w:uiPriority w:val="9"/>
-    <w:semiHidden/>
     <w:rsid w:val="003E0190"/>
     <w:rPr>
       <w:rFonts w:asciiTheme="majorHAnsi" w:eastAsiaTheme="majorEastAsia" w:hAnsiTheme="majorHAnsi" w:cstheme="majorBidi"/>
@@ -3432,6 +3667,50 @@
       <w:szCs w:val="20"/>
     </w:rPr>
   </w:style>
+  <w:style w:type="paragraph" w:styleId="En-tte">
+    <w:name w:val="header"/>
+    <w:basedOn w:val="Normal"/>
+    <w:link w:val="En-tteCar"/>
+    <w:uiPriority w:val="99"/>
+    <w:unhideWhenUsed/>
+    <w:rsid w:val="004749D2"/>
+    <w:pPr>
+      <w:tabs>
+        <w:tab w:val="center" w:pos="4536"/>
+        <w:tab w:val="right" w:pos="9072"/>
+      </w:tabs>
+      <w:spacing w:after="0" w:line="240" w:lineRule="auto"/>
+    </w:pPr>
+  </w:style>
+  <w:style w:type="character" w:customStyle="1" w:styleId="En-tteCar">
+    <w:name w:val="En-tête Car"/>
+    <w:basedOn w:val="Policepardfaut"/>
+    <w:link w:val="En-tte"/>
+    <w:uiPriority w:val="99"/>
+    <w:rsid w:val="004749D2"/>
+  </w:style>
+  <w:style w:type="paragraph" w:styleId="Pieddepage">
+    <w:name w:val="footer"/>
+    <w:basedOn w:val="Normal"/>
+    <w:link w:val="PieddepageCar"/>
+    <w:uiPriority w:val="99"/>
+    <w:unhideWhenUsed/>
+    <w:rsid w:val="004749D2"/>
+    <w:pPr>
+      <w:tabs>
+        <w:tab w:val="center" w:pos="4536"/>
+        <w:tab w:val="right" w:pos="9072"/>
+      </w:tabs>
+      <w:spacing w:after="0" w:line="240" w:lineRule="auto"/>
+    </w:pPr>
+  </w:style>
+  <w:style w:type="character" w:customStyle="1" w:styleId="PieddepageCar">
+    <w:name w:val="Pied de page Car"/>
+    <w:basedOn w:val="Policepardfaut"/>
+    <w:link w:val="Pieddepage"/>
+    <w:uiPriority w:val="99"/>
+    <w:rsid w:val="004749D2"/>
+  </w:style>
 </w:styles>
 </file>
 

</xml_diff>